<commit_message>
fix report: 8th sprint
VM-124
</commit_message>
<xml_diff>
--- a/docs/report/8 спринт 03-05-25.docx
+++ b/docs/report/8 спринт 03-05-25.docx
@@ -541,43 +541,7 @@
           <w:sz w:val="28"/>
           <w:szCs w:val="28"/>
         </w:rPr>
-        <w:t xml:space="preserve">Реализованы пользовательские сценарии </w:t>
-      </w:r>
-      <w:r>
-        <w:rPr>
-          <w:rStyle w:val="translatable-message"/>
-          <w:rFonts w:ascii="Times New Roman" w:hAnsi="Times New Roman" w:cs="Times New Roman"/>
-          <w:sz w:val="28"/>
-          <w:szCs w:val="28"/>
-        </w:rPr>
-        <w:t>«Аутентификация»</w:t>
-      </w:r>
-      <w:r>
-        <w:rPr>
-          <w:rStyle w:val="translatable-message"/>
-          <w:rFonts w:ascii="Times New Roman" w:hAnsi="Times New Roman" w:cs="Times New Roman"/>
-          <w:sz w:val="28"/>
-          <w:szCs w:val="28"/>
-        </w:rPr>
-        <w:t xml:space="preserve"> и </w:t>
-      </w:r>
-      <w:r>
-        <w:rPr>
-          <w:rStyle w:val="translatable-message"/>
-          <w:rFonts w:ascii="Times New Roman" w:hAnsi="Times New Roman" w:cs="Times New Roman"/>
-          <w:sz w:val="28"/>
-          <w:szCs w:val="28"/>
-        </w:rPr>
-        <w:t>«</w:t>
-      </w:r>
-      <w:r>
-        <w:rPr>
-          <w:rStyle w:val="translatable-message"/>
-          <w:rFonts w:ascii="Times New Roman" w:hAnsi="Times New Roman" w:cs="Times New Roman"/>
-          <w:sz w:val="28"/>
-          <w:szCs w:val="28"/>
-        </w:rPr>
-        <w:t>Регистрация</w:t>
+        <w:t>Реализованы пользовательские сценарии «Аутентификация» и «Регистрация</w:t>
       </w:r>
       <w:proofErr w:type="gramStart"/>
       <w:r>
@@ -587,16 +551,7 @@
           <w:sz w:val="28"/>
           <w:szCs w:val="28"/>
         </w:rPr>
-        <w:t>»</w:t>
-      </w:r>
-      <w:r>
-        <w:rPr>
-          <w:rStyle w:val="translatable-message"/>
-          <w:rFonts w:ascii="Times New Roman" w:hAnsi="Times New Roman" w:cs="Times New Roman"/>
-          <w:sz w:val="28"/>
-          <w:szCs w:val="28"/>
-        </w:rPr>
-        <w:t>;</w:t>
+        <w:t>»;</w:t>
       </w:r>
       <w:r>
         <w:rPr>
@@ -835,6 +790,44 @@
           <w:szCs w:val="28"/>
         </w:rPr>
         <w:br/>
+        <w:t>- Настроен</w:t>
+      </w:r>
+      <w:r>
+        <w:rPr>
+          <w:rStyle w:val="translatable-message"/>
+          <w:rFonts w:ascii="Times New Roman" w:hAnsi="Times New Roman" w:cs="Times New Roman"/>
+          <w:sz w:val="28"/>
+          <w:szCs w:val="28"/>
+        </w:rPr>
+        <w:t xml:space="preserve"> CI/CD для </w:t>
+      </w:r>
+      <w:r>
+        <w:rPr>
+          <w:rStyle w:val="translatable-message"/>
+          <w:rFonts w:ascii="Times New Roman" w:hAnsi="Times New Roman" w:cs="Times New Roman"/>
+          <w:sz w:val="28"/>
+          <w:szCs w:val="28"/>
+          <w:lang w:val="en-US"/>
+        </w:rPr>
+        <w:t>Backend</w:t>
+      </w:r>
+      <w:r>
+        <w:rPr>
+          <w:rStyle w:val="translatable-message"/>
+          <w:rFonts w:ascii="Times New Roman" w:hAnsi="Times New Roman" w:cs="Times New Roman"/>
+          <w:sz w:val="28"/>
+          <w:szCs w:val="28"/>
+        </w:rPr>
+        <w:t>;</w:t>
+      </w:r>
+      <w:r>
+        <w:rPr>
+          <w:rStyle w:val="translatable-message"/>
+          <w:rFonts w:ascii="Times New Roman" w:hAnsi="Times New Roman" w:cs="Times New Roman"/>
+          <w:sz w:val="28"/>
+          <w:szCs w:val="28"/>
+        </w:rPr>
+        <w:br/>
         <w:t xml:space="preserve">- Настроен </w:t>
       </w:r>
       <w:r>
@@ -895,6 +888,15 @@
         <w:t>Android</w:t>
       </w:r>
       <w:proofErr w:type="spellEnd"/>
+      <w:r>
+        <w:rPr>
+          <w:rStyle w:val="translatable-message"/>
+          <w:rFonts w:ascii="Times New Roman" w:hAnsi="Times New Roman" w:cs="Times New Roman"/>
+          <w:sz w:val="28"/>
+          <w:szCs w:val="28"/>
+        </w:rPr>
+        <w:t xml:space="preserve"> (выполнен с задержкой в один день)</w:t>
+      </w:r>
       <w:r>
         <w:rPr>
           <w:rStyle w:val="translatable-message"/>
@@ -933,6 +935,8 @@
         </w:rPr>
         <w:t>Сверстана веб админ панель.</w:t>
       </w:r>
+      <w:bookmarkStart w:id="0" w:name="_GoBack"/>
+      <w:bookmarkEnd w:id="0"/>
     </w:p>
     <w:p>
       <w:pPr>
@@ -1080,65 +1084,17 @@
           <w:szCs w:val="28"/>
         </w:rPr>
         <w:br/>
-      </w:r>
-      <w:r>
-        <w:rPr>
-          <w:rStyle w:val="translatable-message"/>
-          <w:rFonts w:ascii="Times New Roman" w:hAnsi="Times New Roman" w:cs="Times New Roman"/>
-          <w:sz w:val="28"/>
-          <w:szCs w:val="28"/>
-        </w:rPr>
         <w:t>-</w:t>
       </w:r>
       <w:proofErr w:type="gramEnd"/>
       <w:r>
-        <w:t xml:space="preserve"> </w:t>
-      </w:r>
-      <w:r>
-        <w:rPr>
-          <w:rStyle w:val="translatable-message"/>
-          <w:rFonts w:ascii="Times New Roman" w:hAnsi="Times New Roman" w:cs="Times New Roman"/>
-          <w:sz w:val="28"/>
-          <w:szCs w:val="28"/>
-        </w:rPr>
-        <w:t xml:space="preserve">Настроить CI/CD для </w:t>
-      </w:r>
-      <w:r>
-        <w:rPr>
-          <w:rStyle w:val="translatable-message"/>
-          <w:rFonts w:ascii="Times New Roman" w:hAnsi="Times New Roman" w:cs="Times New Roman"/>
-          <w:sz w:val="28"/>
-          <w:szCs w:val="28"/>
-          <w:lang w:val="en-US"/>
-        </w:rPr>
-        <w:t>Backend</w:t>
-      </w:r>
-      <w:r>
-        <w:rPr>
-          <w:rStyle w:val="translatable-message"/>
-          <w:rFonts w:ascii="Times New Roman" w:hAnsi="Times New Roman" w:cs="Times New Roman"/>
-          <w:sz w:val="28"/>
-          <w:szCs w:val="28"/>
-        </w:rPr>
-        <w:t>;</w:t>
-      </w:r>
-      <w:r>
-        <w:rPr>
-          <w:rStyle w:val="translatable-message"/>
-          <w:rFonts w:ascii="Times New Roman" w:hAnsi="Times New Roman" w:cs="Times New Roman"/>
-          <w:sz w:val="28"/>
-          <w:szCs w:val="28"/>
-        </w:rPr>
-        <w:br/>
-      </w:r>
-      <w:r>
-        <w:rPr>
-          <w:rStyle w:val="translatable-message"/>
-          <w:rFonts w:ascii="Times New Roman" w:hAnsi="Times New Roman" w:cs="Times New Roman"/>
-          <w:sz w:val="28"/>
-          <w:szCs w:val="28"/>
-        </w:rPr>
-        <w:t>- Покрыть основные компоненты авторизации, регистрации и генерации юнит-тестами в соответствии с тест кейсами;</w:t>
+        <w:rPr>
+          <w:rStyle w:val="translatable-message"/>
+          <w:rFonts w:ascii="Times New Roman" w:hAnsi="Times New Roman" w:cs="Times New Roman"/>
+          <w:sz w:val="28"/>
+          <w:szCs w:val="28"/>
+        </w:rPr>
+        <w:t xml:space="preserve"> Покрыть основные компоненты авторизации, регистрации и генерации юнит-тестами в соответствии с тест кейсами;</w:t>
       </w:r>
     </w:p>
     <w:p>
@@ -1205,25 +1161,7 @@
           <w:sz w:val="28"/>
           <w:szCs w:val="28"/>
         </w:rPr>
-        <w:t>реализацию пользовательского сценария «</w:t>
-      </w:r>
-      <w:r>
-        <w:rPr>
-          <w:rStyle w:val="translatable-message"/>
-          <w:rFonts w:ascii="Times New Roman" w:hAnsi="Times New Roman" w:cs="Times New Roman"/>
-          <w:sz w:val="28"/>
-          <w:szCs w:val="28"/>
-        </w:rPr>
-        <w:t>Генерация</w:t>
-      </w:r>
-      <w:r>
-        <w:rPr>
-          <w:rStyle w:val="translatable-message"/>
-          <w:rFonts w:ascii="Times New Roman" w:hAnsi="Times New Roman" w:cs="Times New Roman"/>
-          <w:sz w:val="28"/>
-          <w:szCs w:val="28"/>
-        </w:rPr>
-        <w:t>» к 05.05.2025 (обсуждаем с разработчиками возможности передачи части их задач остальным членам команды).</w:t>
+        <w:t>реализацию пользовательского сценария «Генерация» к 05.05.2025 (обсуждаем с разработчиками возможности передачи части их задач остальным членам команды).</w:t>
       </w:r>
     </w:p>
     <w:p>
@@ -1351,16 +1289,7 @@
           <w:szCs w:val="28"/>
         </w:rPr>
         <w:br/>
-        <w:t>-</w:t>
-      </w:r>
-      <w:r>
-        <w:rPr>
-          <w:rStyle w:val="translatable-message"/>
-          <w:rFonts w:ascii="Times New Roman" w:hAnsi="Times New Roman" w:cs="Times New Roman"/>
-          <w:sz w:val="28"/>
-          <w:szCs w:val="28"/>
-        </w:rPr>
-        <w:t xml:space="preserve"> Связать админ панель с базой данных.</w:t>
+        <w:t>- Связать админ панель с базой данных.</w:t>
       </w:r>
     </w:p>
     <w:p>
@@ -1603,8 +1532,6 @@
         </w:rPr>
         <w:t>.</w:t>
       </w:r>
-      <w:bookmarkStart w:id="0" w:name="_GoBack"/>
-      <w:bookmarkEnd w:id="0"/>
     </w:p>
     <w:p>
       <w:pPr>

</xml_diff>